<commit_message>
Improved the registers into an array, removing those 4x4 switches
</commit_message>
<xml_diff>
--- a/Documentation/DINGUS 8 Documentation.docx
+++ b/Documentation/DINGUS 8 Documentation.docx
@@ -93,14 +93,7 @@
         <w:rPr>
           <w:rFonts w:ascii="Fira Code" w:hAnsi="Fira Code" w:cs="Fira Code"/>
         </w:rPr>
-        <w:t>Little Endian (0xFFFE -</w:t>
-      </w:r>
-      <w:proofErr w:type="gramStart"/>
-      <w:r>
-        <w:rPr>
-          <w:rFonts w:ascii="Fira Code" w:hAnsi="Fira Code" w:cs="Fira Code"/>
-        </w:rPr>
-        <w:t xml:space="preserve">&gt; </w:t>
+        <w:t xml:space="preserve">Little Endian (0xFFFE -&gt; </w:t>
       </w:r>
       <w:r>
         <w:rPr>
@@ -108,7 +101,6 @@
         </w:rPr>
         <w:t>)</w:t>
       </w:r>
-      <w:proofErr w:type="gramEnd"/>
     </w:p>
     <w:p>
       <w:pPr>
@@ -2324,27 +2316,11 @@
           <w:rFonts w:ascii="Fira Code" w:hAnsi="Fira Code" w:cs="Fira Code"/>
         </w:rPr>
       </w:pPr>
-      <w:proofErr w:type="gramStart"/>
-      <w:r>
-        <w:rPr>
-          <w:rFonts w:ascii="Fira Code" w:hAnsi="Fira Code" w:cs="Fira Code"/>
-        </w:rPr>
-        <w:t>.</w:t>
-      </w:r>
-      <w:proofErr w:type="spellStart"/>
-      <w:r>
-        <w:rPr>
-          <w:rFonts w:ascii="Fira Code" w:hAnsi="Fira Code" w:cs="Fira Code"/>
-        </w:rPr>
-        <w:t>setloc</w:t>
-      </w:r>
-      <w:proofErr w:type="spellEnd"/>
-      <w:proofErr w:type="gramEnd"/>
-      <w:r>
-        <w:rPr>
-          <w:rFonts w:ascii="Fira Code" w:hAnsi="Fira Code" w:cs="Fira Code"/>
-        </w:rPr>
-        <w:t xml:space="preserve"> (IMM16): Set compiler IP to IMM16, a sort of pseudo jump.</w:t>
+      <w:r>
+        <w:rPr>
+          <w:rFonts w:ascii="Fira Code" w:hAnsi="Fira Code" w:cs="Fira Code"/>
+        </w:rPr>
+        <w:t>.setloc (IMM16): Set compiler IP to IMM16, a sort of pseudo jump.</w:t>
       </w:r>
     </w:p>
     <w:p>
@@ -2359,19 +2335,11 @@
           <w:rFonts w:ascii="Fira Code" w:hAnsi="Fira Code" w:cs="Fira Code"/>
         </w:rPr>
       </w:pPr>
-      <w:proofErr w:type="gramStart"/>
-      <w:r>
-        <w:rPr>
-          <w:rFonts w:ascii="Fira Code" w:hAnsi="Fira Code" w:cs="Fira Code"/>
-        </w:rPr>
-        <w:t>.start</w:t>
-      </w:r>
-      <w:proofErr w:type="gramEnd"/>
-      <w:r>
-        <w:rPr>
-          <w:rFonts w:ascii="Fira Code" w:hAnsi="Fira Code" w:cs="Fira Code"/>
-        </w:rPr>
-        <w:t xml:space="preserve"> (IMM16): Set 0xFFFE and 0xFFFF to IMM16 (setting a start address).</w:t>
+      <w:r>
+        <w:rPr>
+          <w:rFonts w:ascii="Fira Code" w:hAnsi="Fira Code" w:cs="Fira Code"/>
+        </w:rPr>
+        <w:t>.start (IMM16): Set 0xFFFE and 0xFFFF to IMM16 (setting a start address).</w:t>
       </w:r>
     </w:p>
     <w:p>
@@ -2959,35 +2927,7 @@
         <w:rPr>
           <w:rFonts w:ascii="Fira Code" w:hAnsi="Fira Code" w:cs="Fira Code"/>
         </w:rPr>
-        <w:t xml:space="preserve">: Flip Destination's value around </w:t>
-      </w:r>
-      <w:proofErr w:type="gramStart"/>
-      <w:r>
-        <w:rPr>
-          <w:rFonts w:ascii="Fira Code" w:hAnsi="Fira Code" w:cs="Fira Code"/>
-        </w:rPr>
-        <w:t>b(</w:t>
-      </w:r>
-      <w:proofErr w:type="gramEnd"/>
-      <w:r>
-        <w:rPr>
-          <w:rFonts w:ascii="Fira Code" w:hAnsi="Fira Code" w:cs="Fira Code"/>
-        </w:rPr>
-        <w:t xml:space="preserve">10101010) -&gt; </w:t>
-      </w:r>
-      <w:proofErr w:type="gramStart"/>
-      <w:r>
-        <w:rPr>
-          <w:rFonts w:ascii="Fira Code" w:hAnsi="Fira Code" w:cs="Fira Code"/>
-        </w:rPr>
-        <w:t>b(</w:t>
-      </w:r>
-      <w:proofErr w:type="gramEnd"/>
-      <w:r>
-        <w:rPr>
-          <w:rFonts w:ascii="Fira Code" w:hAnsi="Fira Code" w:cs="Fira Code"/>
-        </w:rPr>
-        <w:t>01010101) [Z, N].</w:t>
+        <w:t>: Flip Destination's value around b(10101010) -&gt; b(01010101) [Z, N].</w:t>
       </w:r>
     </w:p>
     <w:p>
@@ -3077,7 +3017,6 @@
         </w:rPr>
         <w:t>0x11: PSHR (REG</w:t>
       </w:r>
-      <w:proofErr w:type="gramStart"/>
       <w:r>
         <w:rPr>
           <w:rFonts w:ascii="Fira Code" w:hAnsi="Fira Code" w:cs="Fira Code"/>
@@ -3088,14 +3027,7 @@
         <w:rPr>
           <w:rFonts w:ascii="Fira Code" w:hAnsi="Fira Code" w:cs="Fira Code"/>
         </w:rPr>
-        <w:t>)Source</w:t>
-      </w:r>
-      <w:proofErr w:type="gramEnd"/>
-      <w:r>
-        <w:rPr>
-          <w:rFonts w:ascii="Fira Code" w:hAnsi="Fira Code" w:cs="Fira Code"/>
-        </w:rPr>
-        <w:t>:</w:t>
+        <w:t>)Source:</w:t>
       </w:r>
     </w:p>
     <w:p>
@@ -3141,7 +3073,6 @@
         </w:rPr>
         <w:t>0x12: POP (REG</w:t>
       </w:r>
-      <w:proofErr w:type="gramStart"/>
       <w:r>
         <w:rPr>
           <w:rFonts w:ascii="Fira Code" w:hAnsi="Fira Code" w:cs="Fira Code"/>
@@ -3152,14 +3083,7 @@
         <w:rPr>
           <w:rFonts w:ascii="Fira Code" w:hAnsi="Fira Code" w:cs="Fira Code"/>
         </w:rPr>
-        <w:t>)Destination</w:t>
-      </w:r>
-      <w:proofErr w:type="gramEnd"/>
-      <w:r>
-        <w:rPr>
-          <w:rFonts w:ascii="Fira Code" w:hAnsi="Fira Code" w:cs="Fira Code"/>
-        </w:rPr>
-        <w:t>: [Z]</w:t>
+        <w:t>)Destination: [Z]</w:t>
       </w:r>
     </w:p>
     <w:p>
@@ -4608,7 +4532,7 @@
         <w:rPr>
           <w:rFonts w:ascii="Fira Code" w:hAnsi="Fira Code" w:cs="Fira Code"/>
         </w:rPr>
-        <w:t>: Copy 16-bit address into wide register [Z].</w:t>
+        <w:t>: Copy 16-bit address into wide register.</w:t>
       </w:r>
     </w:p>
     <w:p>
@@ -4696,7 +4620,7 @@
         <w:rPr>
           <w:rFonts w:ascii="Fira Code" w:hAnsi="Fira Code" w:cs="Fira Code"/>
         </w:rPr>
-        <w:t xml:space="preserve"> [Z].</w:t>
+        <w:t>.</w:t>
       </w:r>
     </w:p>
     <w:p>
@@ -4772,7 +4696,7 @@
         <w:rPr>
           <w:rFonts w:ascii="Fira Code" w:hAnsi="Fira Code" w:cs="Fira Code"/>
         </w:rPr>
-        <w:t>: Store 8-bit from Source into memory address pointed to by wide register Destination [Z].</w:t>
+        <w:t>: Store 8-bit from Source into memory address pointed to by wide register Destination.</w:t>
       </w:r>
     </w:p>
     <w:p>
@@ -4862,7 +4786,7 @@
         <w:rPr>
           <w:rFonts w:ascii="Fira Code" w:hAnsi="Fira Code" w:cs="Fira Code"/>
         </w:rPr>
-        <w:t>: Add 16-bit address value to wide register Destination [Z, C].</w:t>
+        <w:t>: Add 16-bit address value to wide register Destination.</w:t>
       </w:r>
     </w:p>
     <w:p>
@@ -4888,7 +4812,7 @@
         <w:rPr>
           <w:rFonts w:ascii="Fira Code" w:hAnsi="Fira Code" w:cs="Fira Code"/>
         </w:rPr>
-        <w:t>: Increment wide register Destination by 1 [Z, C].</w:t>
+        <w:t>: Increment wide register Destination by 1.</w:t>
       </w:r>
     </w:p>
     <w:p>
@@ -4914,7 +4838,19 @@
         <w:rPr>
           <w:rFonts w:ascii="Fira Code" w:hAnsi="Fira Code" w:cs="Fira Code"/>
         </w:rPr>
-        <w:t>: Decrement wide register Destination by 1 [Z, N].</w:t>
+        <w:t xml:space="preserve">: Decrement wide register Destination by </w:t>
+      </w:r>
+      <w:r>
+        <w:rPr>
+          <w:rFonts w:ascii="Fira Code" w:hAnsi="Fira Code" w:cs="Fira Code"/>
+        </w:rPr>
+        <w:t>1</w:t>
+      </w:r>
+      <w:r>
+        <w:rPr>
+          <w:rFonts w:ascii="Fira Code" w:hAnsi="Fira Code" w:cs="Fira Code"/>
+        </w:rPr>
+        <w:t>.</w:t>
       </w:r>
     </w:p>
     <w:p>
@@ -6579,7 +6515,6 @@
   <w:style w:type="character" w:default="1" w:styleId="DefaultParagraphFont">
     <w:name w:val="Default Paragraph Font"/>
     <w:uiPriority w:val="1"/>
-    <w:semiHidden/>
     <w:unhideWhenUsed/>
   </w:style>
   <w:style w:type="table" w:default="1" w:styleId="TableNormal">

</xml_diff>